<commit_message>
corrected Task3 DWH_PG module
</commit_message>
<xml_diff>
--- a/DWH_PG_Task_3.docx
+++ b/DWH_PG_Task_3.docx
@@ -1284,59 +1284,19 @@
           <w:color w:val="000000"/>
           <w:sz w:val="20"/>
           <w:szCs w:val="20"/>
-        </w:rPr>
-      </w:pPr>
-      <w:proofErr w:type="spellStart"/>
+          <w:lang w:val="en-GB"/>
+        </w:rPr>
+      </w:pPr>
       <w:r>
         <w:rPr>
           <w:rFonts w:ascii="Consolas" w:hAnsi="Consolas"/>
           <w:color w:val="808080"/>
           <w:sz w:val="20"/>
           <w:szCs w:val="20"/>
-        </w:rPr>
-        <w:t>Actual</w:t>
-      </w:r>
-      <w:proofErr w:type="spellEnd"/>
-      <w:r>
-        <w:rPr>
-          <w:rFonts w:ascii="Consolas" w:hAnsi="Consolas"/>
-          <w:color w:val="808080"/>
-          <w:sz w:val="20"/>
-          <w:szCs w:val="20"/>
-        </w:rPr>
-        <w:t xml:space="preserve"> </w:t>
-      </w:r>
-      <w:proofErr w:type="spellStart"/>
-      <w:r>
-        <w:rPr>
-          <w:rFonts w:ascii="Consolas" w:hAnsi="Consolas"/>
-          <w:color w:val="808080"/>
-          <w:sz w:val="20"/>
-          <w:szCs w:val="20"/>
-        </w:rPr>
-        <w:t>execution</w:t>
-      </w:r>
-      <w:proofErr w:type="spellEnd"/>
-      <w:r>
-        <w:rPr>
-          <w:rFonts w:ascii="Consolas" w:hAnsi="Consolas"/>
-          <w:color w:val="808080"/>
-          <w:sz w:val="20"/>
-          <w:szCs w:val="20"/>
-        </w:rPr>
-        <w:t xml:space="preserve"> </w:t>
-      </w:r>
-      <w:proofErr w:type="spellStart"/>
-      <w:r>
-        <w:rPr>
-          <w:rFonts w:ascii="Consolas" w:hAnsi="Consolas"/>
-          <w:color w:val="808080"/>
-          <w:sz w:val="20"/>
-          <w:szCs w:val="20"/>
-        </w:rPr>
-        <w:t>time</w:t>
-      </w:r>
-      <w:proofErr w:type="spellEnd"/>
+          <w:lang w:val="en-GB"/>
+        </w:rPr>
+        <w:t>Actual execution time</w:t>
+      </w:r>
     </w:p>
     <w:p>
       <w:pPr>
@@ -1953,7 +1913,8 @@
       </w:pPr>
       <w:r>
         <w:rPr>
-          <w:lang w:val="en-GB"/>
+          <w:noProof/>
+          <w:lang w:eastAsia="ru-RU"/>
         </w:rPr>
         <w:drawing>
           <wp:inline distT="0" distB="0" distL="0" distR="0" wp14:anchorId="33593403" wp14:editId="44A569B6">
@@ -2007,7 +1968,8 @@
       </w:pPr>
       <w:r>
         <w:rPr>
-          <w:lang w:val="en-GB"/>
+          <w:noProof/>
+          <w:lang w:eastAsia="ru-RU"/>
         </w:rPr>
         <w:lastRenderedPageBreak/>
         <w:drawing>
@@ -3278,9 +3240,10 @@
       <w:r>
         <w:rPr>
           <w:rFonts w:ascii="Times New Roman" w:eastAsia="Times New Roman" w:hAnsi="Times New Roman" w:cs="Times New Roman"/>
+          <w:noProof/>
           <w:sz w:val="24"/>
           <w:szCs w:val="24"/>
-          <w:lang w:val="en-GB" w:eastAsia="ru-RU"/>
+          <w:lang w:eastAsia="ru-RU"/>
         </w:rPr>
         <w:drawing>
           <wp:inline distT="0" distB="0" distL="0" distR="0" wp14:anchorId="5747E275" wp14:editId="2ACE9853">
@@ -3332,9 +3295,10 @@
       <w:r>
         <w:rPr>
           <w:rFonts w:ascii="Times New Roman" w:eastAsia="Times New Roman" w:hAnsi="Times New Roman" w:cs="Times New Roman"/>
+          <w:noProof/>
           <w:sz w:val="24"/>
           <w:szCs w:val="24"/>
-          <w:lang w:val="en-GB" w:eastAsia="ru-RU"/>
+          <w:lang w:eastAsia="ru-RU"/>
         </w:rPr>
         <w:lastRenderedPageBreak/>
         <w:drawing>
@@ -4511,10 +4475,11 @@
       <w:r>
         <w:rPr>
           <w:rFonts w:ascii="Consolas" w:eastAsia="Times New Roman" w:hAnsi="Consolas" w:cs="Times New Roman"/>
-          <w:color w:val="000000"/>
-          <w:sz w:val="20"/>
-          <w:szCs w:val="20"/>
-          <w:lang w:val="en-GB" w:eastAsia="ru-RU"/>
+          <w:noProof/>
+          <w:color w:val="000000"/>
+          <w:sz w:val="20"/>
+          <w:szCs w:val="20"/>
+          <w:lang w:eastAsia="ru-RU"/>
         </w:rPr>
         <w:drawing>
           <wp:inline distT="0" distB="0" distL="0" distR="0" wp14:anchorId="7A30AC67" wp14:editId="40E72FAC">
@@ -4672,10 +4637,11 @@
       <w:r>
         <w:rPr>
           <w:rFonts w:ascii="Consolas" w:eastAsia="Times New Roman" w:hAnsi="Consolas" w:cs="Times New Roman"/>
-          <w:color w:val="000000"/>
-          <w:sz w:val="20"/>
-          <w:szCs w:val="20"/>
-          <w:lang w:val="en-GB" w:eastAsia="ru-RU"/>
+          <w:noProof/>
+          <w:color w:val="000000"/>
+          <w:sz w:val="20"/>
+          <w:szCs w:val="20"/>
+          <w:lang w:eastAsia="ru-RU"/>
         </w:rPr>
         <w:drawing>
           <wp:inline distT="0" distB="0" distL="0" distR="0" wp14:anchorId="7D5822A4" wp14:editId="3E809A8F">
@@ -4844,6 +4810,7 @@
       <w:r>
         <w:rPr>
           <w:rFonts w:ascii="Consolas" w:eastAsia="Times New Roman" w:hAnsi="Consolas" w:cs="Times New Roman"/>
+          <w:noProof/>
           <w:color w:val="FF0000"/>
           <w:sz w:val="20"/>
           <w:szCs w:val="20"/>
@@ -5022,54 +4989,32 @@
           <w:color w:val="000000"/>
           <w:sz w:val="20"/>
           <w:szCs w:val="20"/>
-          <w:lang w:eastAsia="ru-RU"/>
-        </w:rPr>
-      </w:pPr>
-      <w:proofErr w:type="spellStart"/>
-      <w:r>
-        <w:rPr>
-          <w:rFonts w:ascii="Consolas" w:eastAsia="Times New Roman" w:hAnsi="Consolas" w:cs="Times New Roman"/>
-          <w:b/>
-          <w:bCs/>
-          <w:color w:val="800000"/>
-          <w:sz w:val="20"/>
-          <w:szCs w:val="20"/>
-          <w:lang w:eastAsia="ru-RU"/>
+          <w:lang w:val="en-GB" w:eastAsia="ru-RU"/>
+        </w:rPr>
+      </w:pPr>
+      <w:proofErr w:type="gramStart"/>
+      <w:r>
+        <w:rPr>
+          <w:rFonts w:ascii="Consolas" w:eastAsia="Times New Roman" w:hAnsi="Consolas" w:cs="Times New Roman"/>
+          <w:b/>
+          <w:bCs/>
+          <w:color w:val="800000"/>
+          <w:sz w:val="20"/>
+          <w:szCs w:val="20"/>
+          <w:lang w:val="en-GB" w:eastAsia="ru-RU"/>
         </w:rPr>
         <w:t>where</w:t>
       </w:r>
-      <w:proofErr w:type="spellEnd"/>
-      <w:r>
-        <w:rPr>
-          <w:rFonts w:ascii="Consolas" w:eastAsia="Times New Roman" w:hAnsi="Consolas" w:cs="Times New Roman"/>
-          <w:color w:val="000000"/>
-          <w:sz w:val="20"/>
-          <w:szCs w:val="20"/>
-          <w:lang w:eastAsia="ru-RU"/>
-        </w:rPr>
-        <w:t xml:space="preserve"> </w:t>
-      </w:r>
-      <w:proofErr w:type="spellStart"/>
-      <w:r>
-        <w:rPr>
-          <w:rFonts w:ascii="Consolas" w:eastAsia="Times New Roman" w:hAnsi="Consolas" w:cs="Times New Roman"/>
-          <w:color w:val="000000"/>
-          <w:sz w:val="20"/>
-          <w:szCs w:val="20"/>
-          <w:lang w:eastAsia="ru-RU"/>
-        </w:rPr>
-        <w:t>id</w:t>
-      </w:r>
-      <w:proofErr w:type="spellEnd"/>
-      <w:r>
-        <w:rPr>
-          <w:rFonts w:ascii="Consolas" w:eastAsia="Times New Roman" w:hAnsi="Consolas" w:cs="Times New Roman"/>
-          <w:color w:val="000000"/>
-          <w:sz w:val="20"/>
-          <w:szCs w:val="20"/>
-          <w:lang w:eastAsia="ru-RU"/>
-        </w:rPr>
-        <w:t xml:space="preserve"> = </w:t>
+      <w:proofErr w:type="gramEnd"/>
+      <w:r>
+        <w:rPr>
+          <w:rFonts w:ascii="Consolas" w:eastAsia="Times New Roman" w:hAnsi="Consolas" w:cs="Times New Roman"/>
+          <w:color w:val="000000"/>
+          <w:sz w:val="20"/>
+          <w:szCs w:val="20"/>
+          <w:lang w:val="en-GB" w:eastAsia="ru-RU"/>
+        </w:rPr>
+        <w:t xml:space="preserve"> id = </w:t>
       </w:r>
       <w:r>
         <w:rPr>
@@ -5077,7 +5022,7 @@
           <w:color w:val="0000FF"/>
           <w:sz w:val="20"/>
           <w:szCs w:val="20"/>
-          <w:lang w:eastAsia="ru-RU"/>
+          <w:lang w:val="en-GB" w:eastAsia="ru-RU"/>
         </w:rPr>
         <w:t>1</w:t>
       </w:r>
@@ -5087,7 +5032,7 @@
           <w:color w:val="FF0000"/>
           <w:sz w:val="20"/>
           <w:szCs w:val="20"/>
-          <w:lang w:eastAsia="ru-RU"/>
+          <w:lang w:val="en-GB" w:eastAsia="ru-RU"/>
         </w:rPr>
         <w:t>;</w:t>
       </w:r>
@@ -5349,10 +5294,11 @@
       <w:r>
         <w:rPr>
           <w:rFonts w:ascii="Consolas" w:eastAsia="Times New Roman" w:hAnsi="Consolas" w:cs="Times New Roman"/>
+          <w:noProof/>
           <w:color w:val="FF0000"/>
           <w:sz w:val="20"/>
           <w:szCs w:val="20"/>
-          <w:lang w:val="en-GB" w:eastAsia="ru-RU"/>
+          <w:lang w:eastAsia="ru-RU"/>
         </w:rPr>
         <w:drawing>
           <wp:inline distT="0" distB="0" distL="0" distR="0" wp14:anchorId="31BD258C" wp14:editId="67BBD2BB">
@@ -6144,10 +6090,11 @@
       <w:r>
         <w:rPr>
           <w:rFonts w:ascii="Consolas" w:eastAsia="Times New Roman" w:hAnsi="Consolas" w:cs="Times New Roman"/>
+          <w:noProof/>
           <w:color w:val="000000" w:themeColor="text1"/>
           <w:sz w:val="20"/>
           <w:szCs w:val="20"/>
-          <w:lang w:val="en-GB" w:eastAsia="ru-RU"/>
+          <w:lang w:eastAsia="ru-RU"/>
         </w:rPr>
         <w:lastRenderedPageBreak/>
         <w:drawing>
@@ -6215,10 +6162,11 @@
       <w:r>
         <w:rPr>
           <w:rFonts w:ascii="Consolas" w:eastAsia="Times New Roman" w:hAnsi="Consolas" w:cs="Times New Roman"/>
+          <w:noProof/>
           <w:color w:val="000000" w:themeColor="text1"/>
           <w:sz w:val="20"/>
           <w:szCs w:val="20"/>
-          <w:lang w:val="en-GB" w:eastAsia="ru-RU"/>
+          <w:lang w:eastAsia="ru-RU"/>
         </w:rPr>
         <w:drawing>
           <wp:inline distT="0" distB="0" distL="0" distR="0" wp14:anchorId="377C492C" wp14:editId="3CC8151D">
@@ -6344,14 +6292,23 @@
     <w:p>
       <w:pPr>
         <w:spacing w:before="100" w:beforeAutospacing="1" w:after="100" w:afterAutospacing="1" w:line="240" w:lineRule="auto"/>
-      </w:pPr>
-      <w:r>
+        <w:rPr>
+          <w:lang w:val="en-GB"/>
+        </w:rPr>
+      </w:pPr>
+      <w:r>
+        <w:rPr>
+          <w:lang w:val="en-GB"/>
+        </w:rPr>
         <w:t>3.1 TASK 3 - BRIN VS B-TREE</w:t>
       </w:r>
     </w:p>
     <w:p>
       <w:pPr>
         <w:spacing w:before="100" w:beforeAutospacing="1" w:after="100" w:afterAutospacing="1" w:line="240" w:lineRule="auto"/>
+        <w:rPr>
+          <w:lang w:val="en-GB"/>
+        </w:rPr>
       </w:pPr>
     </w:p>
     <w:p>
@@ -7399,10 +7356,11 @@
       <w:r>
         <w:rPr>
           <w:rFonts w:ascii="Consolas" w:eastAsia="Times New Roman" w:hAnsi="Consolas" w:cs="Times New Roman"/>
-          <w:color w:val="000000"/>
-          <w:sz w:val="20"/>
-          <w:szCs w:val="20"/>
-          <w:lang w:val="en-GB" w:eastAsia="ru-RU"/>
+          <w:noProof/>
+          <w:color w:val="000000"/>
+          <w:sz w:val="20"/>
+          <w:szCs w:val="20"/>
+          <w:lang w:eastAsia="ru-RU"/>
         </w:rPr>
         <w:drawing>
           <wp:inline distT="0" distB="0" distL="0" distR="0" wp14:anchorId="2FE033CD" wp14:editId="19E653A5">
@@ -7954,9 +7912,10 @@
       <w:r>
         <w:rPr>
           <w:rFonts w:ascii="Times New Roman" w:eastAsia="Times New Roman" w:hAnsi="Times New Roman" w:cs="Times New Roman"/>
+          <w:noProof/>
           <w:sz w:val="24"/>
           <w:szCs w:val="24"/>
-          <w:lang w:val="uk-UA" w:eastAsia="ru-RU"/>
+          <w:lang w:eastAsia="ru-RU"/>
         </w:rPr>
         <w:drawing>
           <wp:inline distT="0" distB="0" distL="0" distR="0" wp14:anchorId="4D4657BD" wp14:editId="1962C78E">
@@ -8008,9 +7967,10 @@
       <w:r>
         <w:rPr>
           <w:rFonts w:ascii="Times New Roman" w:eastAsia="Times New Roman" w:hAnsi="Times New Roman" w:cs="Times New Roman"/>
+          <w:noProof/>
           <w:sz w:val="24"/>
           <w:szCs w:val="24"/>
-          <w:lang w:val="uk-UA" w:eastAsia="ru-RU"/>
+          <w:lang w:eastAsia="ru-RU"/>
         </w:rPr>
         <w:lastRenderedPageBreak/>
         <w:drawing>
@@ -8264,9 +8224,10 @@
       <w:r>
         <w:rPr>
           <w:rFonts w:ascii="Times New Roman" w:eastAsia="Times New Roman" w:hAnsi="Times New Roman" w:cs="Times New Roman"/>
+          <w:noProof/>
           <w:sz w:val="24"/>
           <w:szCs w:val="24"/>
-          <w:lang w:val="en-GB" w:eastAsia="ru-RU"/>
+          <w:lang w:eastAsia="ru-RU"/>
         </w:rPr>
         <w:drawing>
           <wp:inline distT="0" distB="0" distL="0" distR="0" wp14:anchorId="42ABCE02" wp14:editId="1C3030FF">
@@ -8902,9 +8863,10 @@
       <w:r>
         <w:rPr>
           <w:rFonts w:ascii="Times New Roman" w:eastAsia="Times New Roman" w:hAnsi="Times New Roman" w:cs="Times New Roman"/>
+          <w:noProof/>
           <w:sz w:val="24"/>
           <w:szCs w:val="24"/>
-          <w:lang w:val="uk-UA" w:eastAsia="ru-RU"/>
+          <w:lang w:eastAsia="ru-RU"/>
         </w:rPr>
         <w:lastRenderedPageBreak/>
         <w:drawing>
@@ -9172,9 +9134,10 @@
       <w:r>
         <w:rPr>
           <w:rFonts w:ascii="Times New Roman" w:eastAsia="Times New Roman" w:hAnsi="Times New Roman" w:cs="Times New Roman"/>
+          <w:noProof/>
           <w:sz w:val="24"/>
           <w:szCs w:val="24"/>
-          <w:lang w:val="en-GB" w:eastAsia="ru-RU"/>
+          <w:lang w:eastAsia="ru-RU"/>
         </w:rPr>
         <w:drawing>
           <wp:inline distT="0" distB="0" distL="0" distR="0" wp14:anchorId="3ED48A40" wp14:editId="01493E0E">
@@ -9486,9 +9449,10 @@
       <w:r>
         <w:rPr>
           <w:rFonts w:ascii="Times New Roman" w:eastAsia="Times New Roman" w:hAnsi="Times New Roman" w:cs="Times New Roman"/>
+          <w:noProof/>
           <w:sz w:val="24"/>
           <w:szCs w:val="24"/>
-          <w:lang w:val="en-GB" w:eastAsia="ru-RU"/>
+          <w:lang w:eastAsia="ru-RU"/>
         </w:rPr>
         <w:drawing>
           <wp:inline distT="0" distB="0" distL="0" distR="0" wp14:anchorId="1D27C2AB" wp14:editId="446858E5">
@@ -10115,6 +10079,7 @@
       <w:r>
         <w:rPr>
           <w:rFonts w:ascii="Consolas" w:hAnsi="Consolas"/>
+          <w:noProof/>
           <w:color w:val="000000"/>
           <w:sz w:val="20"/>
           <w:szCs w:val="20"/>
@@ -10169,9 +10134,10 @@
       <w:r>
         <w:rPr>
           <w:rFonts w:ascii="Times New Roman" w:eastAsia="Times New Roman" w:hAnsi="Times New Roman" w:cs="Times New Roman"/>
+          <w:noProof/>
           <w:sz w:val="24"/>
           <w:szCs w:val="24"/>
-          <w:lang w:val="en-GB" w:eastAsia="ru-RU"/>
+          <w:lang w:eastAsia="ru-RU"/>
         </w:rPr>
         <w:drawing>
           <wp:inline distT="0" distB="0" distL="0" distR="0" wp14:anchorId="4D87C3CB" wp14:editId="0BA054C9">
@@ -10297,9 +10263,10 @@
       <w:r>
         <w:rPr>
           <w:rFonts w:ascii="Times New Roman" w:eastAsia="Times New Roman" w:hAnsi="Times New Roman" w:cs="Times New Roman"/>
+          <w:noProof/>
           <w:sz w:val="24"/>
           <w:szCs w:val="24"/>
-          <w:lang w:val="en-GB" w:eastAsia="ru-RU"/>
+          <w:lang w:eastAsia="ru-RU"/>
         </w:rPr>
         <w:drawing>
           <wp:inline distT="0" distB="0" distL="0" distR="0" wp14:anchorId="7C7F1C99" wp14:editId="40AD0F02">
@@ -10739,9 +10706,10 @@
       <w:r>
         <w:rPr>
           <w:rFonts w:ascii="Times New Roman" w:eastAsia="Times New Roman" w:hAnsi="Times New Roman" w:cs="Times New Roman"/>
+          <w:noProof/>
           <w:sz w:val="24"/>
           <w:szCs w:val="24"/>
-          <w:lang w:val="en-GB" w:eastAsia="ru-RU"/>
+          <w:lang w:eastAsia="ru-RU"/>
         </w:rPr>
         <w:lastRenderedPageBreak/>
         <w:drawing>
@@ -10794,9 +10762,10 @@
       <w:r>
         <w:rPr>
           <w:rFonts w:ascii="Times New Roman" w:eastAsia="Times New Roman" w:hAnsi="Times New Roman" w:cs="Times New Roman"/>
+          <w:noProof/>
           <w:sz w:val="24"/>
           <w:szCs w:val="24"/>
-          <w:lang w:val="en-GB" w:eastAsia="ru-RU"/>
+          <w:lang w:eastAsia="ru-RU"/>
         </w:rPr>
         <w:drawing>
           <wp:inline distT="0" distB="0" distL="0" distR="0" wp14:anchorId="152DEF40" wp14:editId="788D6B63">
@@ -11074,9 +11043,10 @@
       <w:r>
         <w:rPr>
           <w:rFonts w:ascii="Times New Roman" w:eastAsia="Times New Roman" w:hAnsi="Times New Roman" w:cs="Times New Roman"/>
+          <w:noProof/>
           <w:sz w:val="24"/>
           <w:szCs w:val="24"/>
-          <w:lang w:val="en-GB" w:eastAsia="ru-RU"/>
+          <w:lang w:eastAsia="ru-RU"/>
         </w:rPr>
         <w:drawing>
           <wp:inline distT="0" distB="0" distL="0" distR="0" wp14:anchorId="491E8329" wp14:editId="4C53D870">
@@ -11139,9 +11109,10 @@
       <w:r>
         <w:rPr>
           <w:rFonts w:ascii="Times New Roman" w:eastAsia="Times New Roman" w:hAnsi="Times New Roman" w:cs="Times New Roman"/>
+          <w:noProof/>
           <w:sz w:val="24"/>
           <w:szCs w:val="24"/>
-          <w:lang w:val="en-GB" w:eastAsia="ru-RU"/>
+          <w:lang w:eastAsia="ru-RU"/>
         </w:rPr>
         <w:lastRenderedPageBreak/>
         <w:drawing>
@@ -11245,9 +11216,10 @@
       <w:r>
         <w:rPr>
           <w:rFonts w:ascii="Times New Roman" w:eastAsia="Times New Roman" w:hAnsi="Times New Roman" w:cs="Times New Roman"/>
+          <w:noProof/>
           <w:sz w:val="24"/>
           <w:szCs w:val="24"/>
-          <w:lang w:val="en-GB" w:eastAsia="ru-RU"/>
+          <w:lang w:eastAsia="ru-RU"/>
         </w:rPr>
         <w:drawing>
           <wp:inline distT="0" distB="0" distL="0" distR="0" wp14:anchorId="19E0A521" wp14:editId="55BC81F1">
@@ -11299,9 +11271,10 @@
       <w:r>
         <w:rPr>
           <w:rFonts w:ascii="Times New Roman" w:eastAsia="Times New Roman" w:hAnsi="Times New Roman" w:cs="Times New Roman"/>
+          <w:noProof/>
           <w:sz w:val="24"/>
           <w:szCs w:val="24"/>
-          <w:lang w:val="en-GB" w:eastAsia="ru-RU"/>
+          <w:lang w:eastAsia="ru-RU"/>
         </w:rPr>
         <w:drawing>
           <wp:inline distT="0" distB="0" distL="0" distR="0" wp14:anchorId="6EF68DD9" wp14:editId="255C08E7">
@@ -11441,9 +11414,10 @@
       <w:r>
         <w:rPr>
           <w:rFonts w:ascii="Times New Roman" w:eastAsia="Times New Roman" w:hAnsi="Times New Roman" w:cs="Times New Roman"/>
+          <w:noProof/>
           <w:sz w:val="24"/>
           <w:szCs w:val="24"/>
-          <w:lang w:val="en-GB" w:eastAsia="ru-RU"/>
+          <w:lang w:eastAsia="ru-RU"/>
         </w:rPr>
         <w:lastRenderedPageBreak/>
         <w:drawing>
@@ -11525,9 +11499,10 @@
       <w:r>
         <w:rPr>
           <w:rFonts w:ascii="Times New Roman" w:eastAsia="Times New Roman" w:hAnsi="Times New Roman" w:cs="Times New Roman"/>
+          <w:noProof/>
           <w:sz w:val="24"/>
           <w:szCs w:val="24"/>
-          <w:lang w:val="en-GB" w:eastAsia="ru-RU"/>
+          <w:lang w:eastAsia="ru-RU"/>
         </w:rPr>
         <w:drawing>
           <wp:inline distT="0" distB="0" distL="0" distR="0" wp14:anchorId="1CC762FE" wp14:editId="7189085D">
@@ -11619,9 +11594,10 @@
       <w:r>
         <w:rPr>
           <w:rFonts w:ascii="Times New Roman" w:eastAsia="Times New Roman" w:hAnsi="Times New Roman" w:cs="Times New Roman"/>
+          <w:noProof/>
           <w:sz w:val="24"/>
           <w:szCs w:val="24"/>
-          <w:lang w:val="en-GB" w:eastAsia="ru-RU"/>
+          <w:lang w:eastAsia="ru-RU"/>
         </w:rPr>
         <w:drawing>
           <wp:inline distT="0" distB="0" distL="0" distR="0" wp14:anchorId="6147C63E" wp14:editId="5BF66C01">
@@ -11889,7 +11865,8 @@
       </w:pPr>
       <w:r>
         <w:rPr>
-          <w:lang w:val="en-GB"/>
+          <w:noProof/>
+          <w:lang w:eastAsia="ru-RU"/>
         </w:rPr>
         <w:drawing>
           <wp:inline distT="0" distB="0" distL="0" distR="0" wp14:anchorId="297555EB" wp14:editId="185D9B4D">
@@ -11937,7 +11914,8 @@
       </w:pPr>
       <w:r>
         <w:rPr>
-          <w:lang w:val="en-GB"/>
+          <w:noProof/>
+          <w:lang w:eastAsia="ru-RU"/>
         </w:rPr>
         <w:drawing>
           <wp:inline distT="0" distB="0" distL="0" distR="0" wp14:anchorId="5F45E237" wp14:editId="5DC5BCD8">
@@ -11977,7 +11955,8 @@
       </w:r>
       <w:r>
         <w:rPr>
-          <w:lang w:val="en-GB"/>
+          <w:noProof/>
+          <w:lang w:eastAsia="ru-RU"/>
         </w:rPr>
         <w:drawing>
           <wp:inline distT="0" distB="0" distL="0" distR="0" wp14:anchorId="00066A5D" wp14:editId="3B4E8653">
@@ -12039,7 +12018,8 @@
       </w:pPr>
       <w:r>
         <w:rPr>
-          <w:lang w:val="en-GB"/>
+          <w:noProof/>
+          <w:lang w:eastAsia="ru-RU"/>
         </w:rPr>
         <w:lastRenderedPageBreak/>
         <w:drawing>
@@ -12116,7 +12096,8 @@
       </w:pPr>
       <w:r>
         <w:rPr>
-          <w:lang w:val="uk-UA"/>
+          <w:noProof/>
+          <w:lang w:eastAsia="ru-RU"/>
         </w:rPr>
         <w:drawing>
           <wp:inline distT="0" distB="0" distL="0" distR="0" wp14:anchorId="7A102B15" wp14:editId="0532A114">
@@ -12164,7 +12145,8 @@
       </w:pPr>
       <w:r>
         <w:rPr>
-          <w:lang w:val="uk-UA"/>
+          <w:noProof/>
+          <w:lang w:eastAsia="ru-RU"/>
         </w:rPr>
         <w:drawing>
           <wp:inline distT="0" distB="0" distL="0" distR="0" wp14:anchorId="67D2FD84" wp14:editId="2909ADF0">
@@ -12202,8 +12184,6 @@
           </wp:inline>
         </w:drawing>
       </w:r>
-      <w:bookmarkStart w:id="0" w:name="_GoBack"/>
-      <w:bookmarkEnd w:id="0"/>
     </w:p>
     <w:p>
       <w:pPr>
@@ -12215,15 +12195,17 @@
           <w:lang w:val="en-GB" w:eastAsia="ru-RU"/>
         </w:rPr>
       </w:pPr>
-      <w:r>
+    </w:p>
+    <w:p>
+      <w:pPr>
+        <w:spacing w:before="100" w:beforeAutospacing="1" w:after="100" w:afterAutospacing="1" w:line="240" w:lineRule="auto"/>
         <w:rPr>
           <w:rFonts w:ascii="Times New Roman" w:eastAsia="Times New Roman" w:hAnsi="Times New Roman" w:cs="Times New Roman"/>
           <w:sz w:val="24"/>
           <w:szCs w:val="24"/>
           <w:lang w:val="en-GB" w:eastAsia="ru-RU"/>
         </w:rPr>
-        <w:t>Foreign Data Wrapper (FDW) allows PostgreSQL to work with external data sources as if they were regular database tables.</w:t>
-      </w:r>
+      </w:pPr>
     </w:p>
     <w:p>
       <w:pPr>
@@ -12235,6 +12217,27 @@
           <w:lang w:val="en-GB" w:eastAsia="ru-RU"/>
         </w:rPr>
       </w:pPr>
+      <w:r>
+        <w:rPr>
+          <w:rFonts w:ascii="Times New Roman" w:eastAsia="Times New Roman" w:hAnsi="Times New Roman" w:cs="Times New Roman"/>
+          <w:sz w:val="24"/>
+          <w:szCs w:val="24"/>
+          <w:lang w:val="en-GB" w:eastAsia="ru-RU"/>
+        </w:rPr>
+        <w:lastRenderedPageBreak/>
+        <w:t>Foreign Data Wrapper (FDW) allows PostgreSQL to work with external data sources as if they were regular database tables.</w:t>
+      </w:r>
+    </w:p>
+    <w:p>
+      <w:pPr>
+        <w:spacing w:before="100" w:beforeAutospacing="1" w:after="100" w:afterAutospacing="1" w:line="240" w:lineRule="auto"/>
+        <w:rPr>
+          <w:rFonts w:ascii="Times New Roman" w:eastAsia="Times New Roman" w:hAnsi="Times New Roman" w:cs="Times New Roman"/>
+          <w:sz w:val="24"/>
+          <w:szCs w:val="24"/>
+          <w:lang w:val="en-GB" w:eastAsia="ru-RU"/>
+        </w:rPr>
+      </w:pPr>
       <w:proofErr w:type="spellStart"/>
       <w:r>
         <w:rPr>
@@ -12243,7 +12246,6 @@
           <w:szCs w:val="20"/>
           <w:lang w:val="en-GB" w:eastAsia="ru-RU"/>
         </w:rPr>
-        <w:lastRenderedPageBreak/>
         <w:t>F</w:t>
       </w:r>
       <w:r>
@@ -12427,6 +12429,264 @@
           <w:lang w:val="en-GB"/>
         </w:rPr>
       </w:pPr>
+      <w:r>
+        <w:rPr>
+          <w:lang w:val="en-GB"/>
+        </w:rPr>
+        <w:drawing>
+          <wp:inline distT="0" distB="0" distL="0" distR="0" wp14:anchorId="1BFB64C3" wp14:editId="58C32E95">
+            <wp:extent cx="5731510" cy="4213225"/>
+            <wp:effectExtent l="0" t="0" r="2540" b="0"/>
+            <wp:docPr id="2" name="Рисунок 2"/>
+            <wp:cNvGraphicFramePr>
+              <a:graphicFrameLocks xmlns:a="http://schemas.openxmlformats.org/drawingml/2006/main" noChangeAspect="1"/>
+            </wp:cNvGraphicFramePr>
+            <a:graphic xmlns:a="http://schemas.openxmlformats.org/drawingml/2006/main">
+              <a:graphicData uri="http://schemas.openxmlformats.org/drawingml/2006/picture">
+                <pic:pic xmlns:pic="http://schemas.openxmlformats.org/drawingml/2006/picture">
+                  <pic:nvPicPr>
+                    <pic:cNvPr id="1" name=""/>
+                    <pic:cNvPicPr/>
+                  </pic:nvPicPr>
+                  <pic:blipFill>
+                    <a:blip r:embed="rId40"/>
+                    <a:stretch>
+                      <a:fillRect/>
+                    </a:stretch>
+                  </pic:blipFill>
+                  <pic:spPr>
+                    <a:xfrm>
+                      <a:off x="0" y="0"/>
+                      <a:ext cx="5731510" cy="4213225"/>
+                    </a:xfrm>
+                    <a:prstGeom prst="rect">
+                      <a:avLst/>
+                    </a:prstGeom>
+                  </pic:spPr>
+                </pic:pic>
+              </a:graphicData>
+            </a:graphic>
+          </wp:inline>
+        </w:drawing>
+      </w:r>
+    </w:p>
+    <w:p>
+      <w:pPr>
+        <w:spacing w:before="100" w:beforeAutospacing="1" w:after="100" w:afterAutospacing="1" w:line="240" w:lineRule="auto"/>
+        <w:rPr>
+          <w:lang w:val="en-GB"/>
+        </w:rPr>
+      </w:pPr>
+      <w:r>
+        <w:rPr>
+          <w:lang w:val="en-GB"/>
+        </w:rPr>
+        <w:lastRenderedPageBreak/>
+        <w:drawing>
+          <wp:inline distT="0" distB="0" distL="0" distR="0" wp14:anchorId="4371F937" wp14:editId="71F8F853">
+            <wp:extent cx="4591691" cy="6134956"/>
+            <wp:effectExtent l="0" t="0" r="0" b="0"/>
+            <wp:docPr id="4" name="Рисунок 4"/>
+            <wp:cNvGraphicFramePr>
+              <a:graphicFrameLocks xmlns:a="http://schemas.openxmlformats.org/drawingml/2006/main" noChangeAspect="1"/>
+            </wp:cNvGraphicFramePr>
+            <a:graphic xmlns:a="http://schemas.openxmlformats.org/drawingml/2006/main">
+              <a:graphicData uri="http://schemas.openxmlformats.org/drawingml/2006/picture">
+                <pic:pic xmlns:pic="http://schemas.openxmlformats.org/drawingml/2006/picture">
+                  <pic:nvPicPr>
+                    <pic:cNvPr id="1" name=""/>
+                    <pic:cNvPicPr/>
+                  </pic:nvPicPr>
+                  <pic:blipFill>
+                    <a:blip r:embed="rId41"/>
+                    <a:stretch>
+                      <a:fillRect/>
+                    </a:stretch>
+                  </pic:blipFill>
+                  <pic:spPr>
+                    <a:xfrm>
+                      <a:off x="0" y="0"/>
+                      <a:ext cx="4591691" cy="6134956"/>
+                    </a:xfrm>
+                    <a:prstGeom prst="rect">
+                      <a:avLst/>
+                    </a:prstGeom>
+                  </pic:spPr>
+                </pic:pic>
+              </a:graphicData>
+            </a:graphic>
+          </wp:inline>
+        </w:drawing>
+      </w:r>
+    </w:p>
+    <w:p>
+      <w:pPr>
+        <w:spacing w:before="100" w:beforeAutospacing="1" w:after="100" w:afterAutospacing="1" w:line="240" w:lineRule="auto"/>
+        <w:rPr>
+          <w:lang w:val="en-GB"/>
+        </w:rPr>
+      </w:pPr>
+      <w:r>
+        <w:rPr>
+          <w:lang w:val="en-GB"/>
+        </w:rPr>
+        <w:t>Missed that insert was made only for one column, corrected</w:t>
+      </w:r>
+    </w:p>
+    <w:p>
+      <w:pPr>
+        <w:spacing w:before="100" w:beforeAutospacing="1" w:after="100" w:afterAutospacing="1" w:line="240" w:lineRule="auto"/>
+        <w:rPr>
+          <w:lang w:val="en-GB"/>
+        </w:rPr>
+      </w:pPr>
+    </w:p>
+    <w:p>
+      <w:pPr>
+        <w:spacing w:before="100" w:beforeAutospacing="1" w:after="100" w:afterAutospacing="1" w:line="240" w:lineRule="auto"/>
+        <w:rPr>
+          <w:lang w:val="en-GB"/>
+        </w:rPr>
+      </w:pPr>
+      <w:r>
+        <w:rPr>
+          <w:lang w:val="en-GB"/>
+        </w:rPr>
+        <w:lastRenderedPageBreak/>
+        <w:drawing>
+          <wp:inline distT="0" distB="0" distL="0" distR="0" wp14:anchorId="431EB877" wp14:editId="0BD4A80B">
+            <wp:extent cx="5731510" cy="2658110"/>
+            <wp:effectExtent l="0" t="0" r="2540" b="8890"/>
+            <wp:docPr id="5" name="Рисунок 5"/>
+            <wp:cNvGraphicFramePr>
+              <a:graphicFrameLocks xmlns:a="http://schemas.openxmlformats.org/drawingml/2006/main" noChangeAspect="1"/>
+            </wp:cNvGraphicFramePr>
+            <a:graphic xmlns:a="http://schemas.openxmlformats.org/drawingml/2006/main">
+              <a:graphicData uri="http://schemas.openxmlformats.org/drawingml/2006/picture">
+                <pic:pic xmlns:pic="http://schemas.openxmlformats.org/drawingml/2006/picture">
+                  <pic:nvPicPr>
+                    <pic:cNvPr id="1" name=""/>
+                    <pic:cNvPicPr/>
+                  </pic:nvPicPr>
+                  <pic:blipFill>
+                    <a:blip r:embed="rId42"/>
+                    <a:stretch>
+                      <a:fillRect/>
+                    </a:stretch>
+                  </pic:blipFill>
+                  <pic:spPr>
+                    <a:xfrm>
+                      <a:off x="0" y="0"/>
+                      <a:ext cx="5731510" cy="2658110"/>
+                    </a:xfrm>
+                    <a:prstGeom prst="rect">
+                      <a:avLst/>
+                    </a:prstGeom>
+                  </pic:spPr>
+                </pic:pic>
+              </a:graphicData>
+            </a:graphic>
+          </wp:inline>
+        </w:drawing>
+      </w:r>
+    </w:p>
+    <w:p>
+      <w:pPr>
+        <w:spacing w:before="100" w:beforeAutospacing="1" w:after="100" w:afterAutospacing="1" w:line="240" w:lineRule="auto"/>
+        <w:rPr>
+          <w:lang w:val="en-GB"/>
+        </w:rPr>
+      </w:pPr>
+      <w:r>
+        <w:rPr>
+          <w:lang w:val="en-GB"/>
+        </w:rPr>
+        <w:drawing>
+          <wp:inline distT="0" distB="0" distL="0" distR="0" wp14:anchorId="712625EB" wp14:editId="3EE1237A">
+            <wp:extent cx="2762636" cy="3019846"/>
+            <wp:effectExtent l="0" t="0" r="0" b="0"/>
+            <wp:docPr id="18" name="Рисунок 18"/>
+            <wp:cNvGraphicFramePr>
+              <a:graphicFrameLocks xmlns:a="http://schemas.openxmlformats.org/drawingml/2006/main" noChangeAspect="1"/>
+            </wp:cNvGraphicFramePr>
+            <a:graphic xmlns:a="http://schemas.openxmlformats.org/drawingml/2006/main">
+              <a:graphicData uri="http://schemas.openxmlformats.org/drawingml/2006/picture">
+                <pic:pic xmlns:pic="http://schemas.openxmlformats.org/drawingml/2006/picture">
+                  <pic:nvPicPr>
+                    <pic:cNvPr id="1" name=""/>
+                    <pic:cNvPicPr/>
+                  </pic:nvPicPr>
+                  <pic:blipFill>
+                    <a:blip r:embed="rId43"/>
+                    <a:stretch>
+                      <a:fillRect/>
+                    </a:stretch>
+                  </pic:blipFill>
+                  <pic:spPr>
+                    <a:xfrm>
+                      <a:off x="0" y="0"/>
+                      <a:ext cx="2762636" cy="3019846"/>
+                    </a:xfrm>
+                    <a:prstGeom prst="rect">
+                      <a:avLst/>
+                    </a:prstGeom>
+                  </pic:spPr>
+                </pic:pic>
+              </a:graphicData>
+            </a:graphic>
+          </wp:inline>
+        </w:drawing>
+      </w:r>
+    </w:p>
+    <w:p>
+      <w:pPr>
+        <w:spacing w:before="100" w:beforeAutospacing="1" w:after="100" w:afterAutospacing="1" w:line="240" w:lineRule="auto"/>
+        <w:rPr>
+          <w:lang w:val="en-GB"/>
+        </w:rPr>
+      </w:pPr>
+      <w:r>
+        <w:rPr>
+          <w:lang w:val="en-GB"/>
+        </w:rPr>
+        <w:drawing>
+          <wp:inline distT="0" distB="0" distL="0" distR="0" wp14:anchorId="3DF31C26" wp14:editId="0AE671B2">
+            <wp:extent cx="5731510" cy="2578100"/>
+            <wp:effectExtent l="0" t="0" r="2540" b="0"/>
+            <wp:docPr id="24" name="Рисунок 24"/>
+            <wp:cNvGraphicFramePr>
+              <a:graphicFrameLocks xmlns:a="http://schemas.openxmlformats.org/drawingml/2006/main" noChangeAspect="1"/>
+            </wp:cNvGraphicFramePr>
+            <a:graphic xmlns:a="http://schemas.openxmlformats.org/drawingml/2006/main">
+              <a:graphicData uri="http://schemas.openxmlformats.org/drawingml/2006/picture">
+                <pic:pic xmlns:pic="http://schemas.openxmlformats.org/drawingml/2006/picture">
+                  <pic:nvPicPr>
+                    <pic:cNvPr id="1" name=""/>
+                    <pic:cNvPicPr/>
+                  </pic:nvPicPr>
+                  <pic:blipFill>
+                    <a:blip r:embed="rId44"/>
+                    <a:stretch>
+                      <a:fillRect/>
+                    </a:stretch>
+                  </pic:blipFill>
+                  <pic:spPr>
+                    <a:xfrm>
+                      <a:off x="0" y="0"/>
+                      <a:ext cx="5731510" cy="2578100"/>
+                    </a:xfrm>
+                    <a:prstGeom prst="rect">
+                      <a:avLst/>
+                    </a:prstGeom>
+                  </pic:spPr>
+                </pic:pic>
+              </a:graphicData>
+            </a:graphic>
+          </wp:inline>
+        </w:drawing>
+      </w:r>
+      <w:bookmarkStart w:id="0" w:name="_GoBack"/>
+      <w:bookmarkEnd w:id="0"/>
     </w:p>
     <w:p>
       <w:pPr>

</xml_diff>